<commit_message>
docs: add Real Prospects section to David's walkthrough doc
</commit_message>
<xml_diff>
--- a/David_Leads_Access_and_Tour.docx
+++ b/David_Leads_Access_and_Tour.docx
@@ -361,7 +361,7 @@
       <w:pPr>
         <w:spacing w:after="120" w:before="120"/>
       </w:pPr>
-      <w:hyperlink w:history="1" r:id="rId6omv5q6ybaqu8wjsjzaam">
+      <w:hyperlink w:history="1" r:id="rIdxtxl9mgl1zxrtzstdtshh">
         <w:r>
           <w:rPr>
             <w:rFonts w:ascii="Calibri" w:cs="Calibri" w:eastAsia="Calibri" w:hAnsi="Calibri"/>
@@ -619,6 +619,120 @@
           <w:szCs w:val="21"/>
         </w:rPr>
         <w:t xml:space="preserve">"Open the Black Box" shows the transparent scoring methodology (with its published reference, DOI 10.5281/zenodo.20434308). "Export Call List" downloads your ranked leads as a spreadsheet. "Push to CRM" sends enriched, receipted leads into your CRM.</w:t>
+      </w:r>
+    </w:p>
+    <w:p>
+      <w:pPr>
+        <w:pBdr>
+          <w:bottom w:val="single" w:color="D4D1CA" w:sz="6" w:space="4"/>
+        </w:pBdr>
+        <w:spacing w:after="100" w:before="260"/>
+      </w:pPr>
+      <w:r>
+        <w:rPr>
+          <w:rFonts w:ascii="Calibri" w:cs="Calibri" w:eastAsia="Calibri" w:hAnsi="Calibri"/>
+          <w:b/>
+          <w:bCs/>
+          <w:color w:val="0A2540"/>
+          <w:sz w:val="26"/>
+          <w:szCs w:val="26"/>
+        </w:rPr>
+        <w:t xml:space="preserve">Real prospects you can act on today</w:t>
+      </w:r>
+    </w:p>
+    <w:p>
+      <w:pPr>
+        <w:spacing w:after="120"/>
+      </w:pPr>
+      <w:r>
+        <w:rPr>
+          <w:rFonts w:ascii="Calibri" w:cs="Calibri" w:eastAsia="Calibri" w:hAnsi="Calibri"/>
+          <w:i/>
+          <w:iCs/>
+          <w:color w:val="5A6B7C"/>
+          <w:sz w:val="19"/>
+          <w:szCs w:val="19"/>
+        </w:rPr>
+        <w:t xml:space="preserve">Click "Real Prospects" in the toolbar. This pulls REAL, currently-filed public business and professional-license records live from state portals (Delaware &amp; Connecticut to start) — actual businesses with their public business address and a suggested New York Life angle (key-person, buy-sell, business-continuation, disability overhead, or starter life + DI for new licensees).</w:t>
+      </w:r>
+    </w:p>
+    <w:p>
+      <w:pPr>
+        <w:pStyle w:val="ListParagraph"/>
+        <w:numPr>
+          <w:ilvl w:val="0"/>
+          <w:numId w:val="1"/>
+        </w:numPr>
+        <w:spacing w:after="70"/>
+      </w:pPr>
+      <w:r>
+        <w:rPr>
+          <w:rFonts w:ascii="Calibri" w:cs="Calibri" w:eastAsia="Calibri" w:hAnsi="Calibri"/>
+          <w:color w:val="28251D"/>
+          <w:sz w:val="21"/>
+          <w:szCs w:val="21"/>
+        </w:rPr>
+        <w:t xml:space="preserve">Each row is a real public record — real business name, category, public business address, and a link to the official source. Every row has a Verify button (signed receipt).</w:t>
+      </w:r>
+    </w:p>
+    <w:p>
+      <w:pPr>
+        <w:pStyle w:val="ListParagraph"/>
+        <w:numPr>
+          <w:ilvl w:val="0"/>
+          <w:numId w:val="1"/>
+        </w:numPr>
+        <w:spacing w:after="70"/>
+      </w:pPr>
+      <w:r>
+        <w:rPr>
+          <w:rFonts w:ascii="Calibri" w:cs="Calibri" w:eastAsia="Calibri" w:hAnsi="Calibri"/>
+          <w:b/>
+          <w:bCs/>
+          <w:color w:val="0A2540"/>
+          <w:sz w:val="21"/>
+          <w:szCs w:val="21"/>
+        </w:rPr>
+        <w:t xml:space="preserve">Compliant by design.  </w:t>
+      </w:r>
+      <w:r>
+        <w:rPr>
+          <w:rFonts w:ascii="Calibri" w:cs="Calibri" w:eastAsia="Calibri" w:hAnsi="Calibri"/>
+          <w:color w:val="28251D"/>
+          <w:sz w:val="21"/>
+          <w:szCs w:val="21"/>
+        </w:rPr>
+        <w:t xml:space="preserve">It uses public BUSINESS records only — no private personal phone numbers, no social media, nothing fabricated. You do your own compliant outreach (look up the business, no auto-dialing).</w:t>
+      </w:r>
+    </w:p>
+    <w:p>
+      <w:pPr>
+        <w:pStyle w:val="ListParagraph"/>
+        <w:numPr>
+          <w:ilvl w:val="0"/>
+          <w:numId w:val="1"/>
+        </w:numPr>
+        <w:spacing w:after="70"/>
+      </w:pPr>
+      <w:r>
+        <w:rPr>
+          <w:rFonts w:ascii="Calibri" w:cs="Calibri" w:eastAsia="Calibri" w:hAnsi="Calibri"/>
+          <w:b/>
+          <w:bCs/>
+          <w:color w:val="0A2540"/>
+          <w:sz w:val="21"/>
+          <w:szCs w:val="21"/>
+        </w:rPr>
+        <w:t xml:space="preserve">Growing.  </w:t>
+      </w:r>
+      <w:r>
+        <w:rPr>
+          <w:rFonts w:ascii="Calibri" w:cs="Calibri" w:eastAsia="Calibri" w:hAnsi="Calibri"/>
+          <w:color w:val="28251D"/>
+          <w:sz w:val="21"/>
+          <w:szCs w:val="21"/>
+        </w:rPr>
+        <w:t xml:space="preserve">This is the start: more states and record types are easy to add, plus an opt-in web form so prospects who want to hear from you come to you directly.</w:t>
       </w:r>
     </w:p>
     <w:p>

</xml_diff>

<commit_message>
docs: add Tax Territories + Opt-In sections to David's tour doc
</commit_message>
<xml_diff>
--- a/David_Leads_Access_and_Tour.docx
+++ b/David_Leads_Access_and_Tour.docx
@@ -361,7 +361,7 @@
       <w:pPr>
         <w:spacing w:after="120" w:before="120"/>
       </w:pPr>
-      <w:hyperlink w:history="1" r:id="rIdxtxl9mgl1zxrtzstdtshh">
+      <w:hyperlink w:history="1" r:id="rIddeprpmedgym9dp4wkracg">
         <w:r>
           <w:rPr>
             <w:rFonts w:ascii="Calibri" w:cs="Calibri" w:eastAsia="Calibri" w:hAnsi="Calibri"/>
@@ -733,6 +733,286 @@
           <w:szCs w:val="21"/>
         </w:rPr>
         <w:t xml:space="preserve">This is the start: more states and record types are easy to add, plus an opt-in web form so prospects who want to hear from you come to you directly.</w:t>
+      </w:r>
+    </w:p>
+    <w:p>
+      <w:pPr>
+        <w:pBdr>
+          <w:bottom w:val="single" w:color="D4D1CA" w:sz="6" w:space="4"/>
+        </w:pBdr>
+        <w:spacing w:after="100" w:before="260"/>
+      </w:pPr>
+      <w:r>
+        <w:rPr>
+          <w:rFonts w:ascii="Calibri" w:cs="Calibri" w:eastAsia="Calibri" w:hAnsi="Calibri"/>
+          <w:b/>
+          <w:bCs/>
+          <w:color w:val="0A2540"/>
+          <w:sz w:val="26"/>
+          <w:szCs w:val="26"/>
+        </w:rPr>
+        <w:t xml:space="preserve">Tax-smart territories</w:t>
+      </w:r>
+    </w:p>
+    <w:p>
+      <w:pPr>
+        <w:spacing w:after="120"/>
+      </w:pPr>
+      <w:r>
+        <w:rPr>
+          <w:rFonts w:ascii="Calibri" w:cs="Calibri" w:eastAsia="Calibri" w:hAnsi="Calibri"/>
+          <w:i/>
+          <w:iCs/>
+          <w:color w:val="5A6B7C"/>
+          <w:sz w:val="19"/>
+          <w:szCs w:val="19"/>
+        </w:rPr>
+        <w:t xml:space="preserve">Click "Tax Territories" in the toolbar. You asked whether taxes could help find leads — they can. This reads free public IRS tax statistics to point you at the right neighborhoods, never named individuals. Two views:</w:t>
+      </w:r>
+    </w:p>
+    <w:p>
+      <w:pPr>
+        <w:pStyle w:val="ListParagraph"/>
+        <w:numPr>
+          <w:ilvl w:val="0"/>
+          <w:numId w:val="1"/>
+        </w:numPr>
+        <w:spacing w:after="70"/>
+      </w:pPr>
+      <w:r>
+        <w:rPr>
+          <w:rFonts w:ascii="Calibri" w:cs="Calibri" w:eastAsia="Calibri" w:hAnsi="Calibri"/>
+          <w:b/>
+          <w:bCs/>
+          <w:color w:val="0A2540"/>
+          <w:sz w:val="21"/>
+          <w:szCs w:val="21"/>
+        </w:rPr>
+        <w:t xml:space="preserve">1. Affluent ZIPs.  </w:t>
+      </w:r>
+      <w:r>
+        <w:rPr>
+          <w:rFonts w:ascii="Calibri" w:cs="Calibri" w:eastAsia="Calibri" w:hAnsi="Calibri"/>
+          <w:color w:val="28251D"/>
+          <w:sz w:val="21"/>
+          <w:szCs w:val="21"/>
+        </w:rPr>
+        <w:t xml:space="preserve">Ranked ZIP codes where the most households file high-income returns ($200k+ adjusted gross income). Top of your list today is ZIP 10023 in Manhattan — about 11,500 high-income returns, roughly a third of all filers there. The suggested angle is estate planning, premium-financed life, and annuities. These are affluent-territory targets, drawn from IRS Statistics of Income by ZIP code.</w:t>
+      </w:r>
+    </w:p>
+    <w:p>
+      <w:pPr>
+        <w:pStyle w:val="ListParagraph"/>
+        <w:numPr>
+          <w:ilvl w:val="0"/>
+          <w:numId w:val="1"/>
+        </w:numPr>
+        <w:spacing w:after="70"/>
+      </w:pPr>
+      <w:r>
+        <w:rPr>
+          <w:rFonts w:ascii="Calibri" w:cs="Calibri" w:eastAsia="Calibri" w:hAnsi="Calibri"/>
+          <w:b/>
+          <w:bCs/>
+          <w:color w:val="0A2540"/>
+          <w:sz w:val="21"/>
+          <w:szCs w:val="21"/>
+        </w:rPr>
+        <w:t xml:space="preserve">2. Money-in-motion counties.  </w:t>
+      </w:r>
+      <w:r>
+        <w:rPr>
+          <w:rFonts w:ascii="Calibri" w:cs="Calibri" w:eastAsia="Calibri" w:hAnsi="Calibri"/>
+          <w:color w:val="28251D"/>
+          <w:sz w:val="21"/>
+          <w:szCs w:val="21"/>
+        </w:rPr>
+        <w:t xml:space="preserve">Counties seeing the biggest inflow of people and income from elsewhere — a relocation is a classic trigger for an estate and coverage review. Top today is New York County, with about $14.8 billion in adjusted gross income moving in (≈77,900 returns), drawn from IRS county-to-county migration data. The angle is a new-resident coverage review.</w:t>
+      </w:r>
+    </w:p>
+    <w:p>
+      <w:pPr>
+        <w:pStyle w:val="ListParagraph"/>
+        <w:numPr>
+          <w:ilvl w:val="0"/>
+          <w:numId w:val="1"/>
+        </w:numPr>
+        <w:spacing w:after="70"/>
+      </w:pPr>
+      <w:r>
+        <w:rPr>
+          <w:rFonts w:ascii="Calibri" w:cs="Calibri" w:eastAsia="Calibri" w:hAnsi="Calibri"/>
+          <w:b/>
+          <w:bCs/>
+          <w:color w:val="0A2540"/>
+          <w:sz w:val="21"/>
+          <w:szCs w:val="21"/>
+        </w:rPr>
+        <w:t xml:space="preserve">Compliant by design.  </w:t>
+      </w:r>
+      <w:r>
+        <w:rPr>
+          <w:rFonts w:ascii="Calibri" w:cs="Calibri" w:eastAsia="Calibri" w:hAnsi="Calibri"/>
+          <w:color w:val="28251D"/>
+          <w:sz w:val="21"/>
+          <w:szCs w:val="21"/>
+        </w:rPr>
+        <w:t xml:space="preserve">This uses aggregate IRS tax statistics for territory targeting only — it never names a person and never uses anyone's private tax data. It tells you where to focus, then you prospect compliantly in those areas.</w:t>
+      </w:r>
+    </w:p>
+    <w:p>
+      <w:pPr>
+        <w:pStyle w:val="ListParagraph"/>
+        <w:numPr>
+          <w:ilvl w:val="0"/>
+          <w:numId w:val="1"/>
+        </w:numPr>
+        <w:spacing w:after="70"/>
+      </w:pPr>
+      <w:r>
+        <w:rPr>
+          <w:rFonts w:ascii="Calibri" w:cs="Calibri" w:eastAsia="Calibri" w:hAnsi="Calibri"/>
+          <w:b/>
+          <w:bCs/>
+          <w:color w:val="0A2540"/>
+          <w:sz w:val="21"/>
+          <w:szCs w:val="21"/>
+        </w:rPr>
+        <w:t xml:space="preserve">Provable.  </w:t>
+      </w:r>
+      <w:r>
+        <w:rPr>
+          <w:rFonts w:ascii="Calibri" w:cs="Calibri" w:eastAsia="Calibri" w:hAnsi="Calibri"/>
+          <w:color w:val="28251D"/>
+          <w:sz w:val="21"/>
+          <w:szCs w:val="21"/>
+        </w:rPr>
+        <w:t xml:space="preserve">Every territory row links to the official IRS source and carries a signed receipt, same as your leads.</w:t>
+      </w:r>
+    </w:p>
+    <w:p>
+      <w:pPr>
+        <w:pBdr>
+          <w:bottom w:val="single" w:color="D4D1CA" w:sz="6" w:space="4"/>
+        </w:pBdr>
+        <w:spacing w:after="100" w:before="260"/>
+      </w:pPr>
+      <w:r>
+        <w:rPr>
+          <w:rFonts w:ascii="Calibri" w:cs="Calibri" w:eastAsia="Calibri" w:hAnsi="Calibri"/>
+          <w:b/>
+          <w:bCs/>
+          <w:color w:val="0A2540"/>
+          <w:sz w:val="26"/>
+          <w:szCs w:val="26"/>
+        </w:rPr>
+        <w:t xml:space="preserve">Let prospects come to you</w:t>
+      </w:r>
+    </w:p>
+    <w:p>
+      <w:pPr>
+        <w:spacing w:after="120"/>
+      </w:pPr>
+      <w:r>
+        <w:rPr>
+          <w:rFonts w:ascii="Calibri" w:cs="Calibri" w:eastAsia="Calibri" w:hAnsi="Calibri"/>
+          <w:i/>
+          <w:iCs/>
+          <w:color w:val="5A6B7C"/>
+          <w:sz w:val="19"/>
+          <w:szCs w:val="19"/>
+        </w:rPr>
+        <w:t xml:space="preserve">Click "Opt-In Form" in the toolbar. This is the cleanest way to get a real name and a real phone number you can call — because the prospect gives it to you and asks to be contacted.</w:t>
+      </w:r>
+    </w:p>
+    <w:p>
+      <w:pPr>
+        <w:pStyle w:val="ListParagraph"/>
+        <w:numPr>
+          <w:ilvl w:val="0"/>
+          <w:numId w:val="1"/>
+        </w:numPr>
+        <w:spacing w:after="70"/>
+      </w:pPr>
+      <w:r>
+        <w:rPr>
+          <w:rFonts w:ascii="Calibri" w:cs="Calibri" w:eastAsia="Calibri" w:hAnsi="Calibri"/>
+          <w:b/>
+          <w:bCs/>
+          <w:color w:val="0A2540"/>
+          <w:sz w:val="21"/>
+          <w:szCs w:val="21"/>
+        </w:rPr>
+        <w:t xml:space="preserve">How it works.  </w:t>
+      </w:r>
+      <w:r>
+        <w:rPr>
+          <w:rFonts w:ascii="Calibri" w:cs="Calibri" w:eastAsia="Calibri" w:hAnsi="Calibri"/>
+          <w:color w:val="28251D"/>
+          <w:sz w:val="21"/>
+          <w:szCs w:val="21"/>
+        </w:rPr>
+        <w:t xml:space="preserve">Anyone interested fills in their name, phone, email, and a note, and checks a box consenting to be contacted. Their details are only saved if they check that box — no consent, nothing is stored.</w:t>
+      </w:r>
+    </w:p>
+    <w:p>
+      <w:pPr>
+        <w:pStyle w:val="ListParagraph"/>
+        <w:numPr>
+          <w:ilvl w:val="0"/>
+          <w:numId w:val="1"/>
+        </w:numPr>
+        <w:spacing w:after="70"/>
+      </w:pPr>
+      <w:r>
+        <w:rPr>
+          <w:rFonts w:ascii="Calibri" w:cs="Calibri" w:eastAsia="Calibri" w:hAnsi="Calibri"/>
+          <w:b/>
+          <w:bCs/>
+          <w:color w:val="0A2540"/>
+          <w:sz w:val="21"/>
+          <w:szCs w:val="21"/>
+        </w:rPr>
+        <w:t xml:space="preserve">Call-ready &amp; TCPA-safe.  </w:t>
+      </w:r>
+      <w:r>
+        <w:rPr>
+          <w:rFonts w:ascii="Calibri" w:cs="Calibri" w:eastAsia="Calibri" w:hAnsi="Calibri"/>
+          <w:color w:val="28251D"/>
+          <w:sz w:val="21"/>
+          <w:szCs w:val="21"/>
+        </w:rPr>
+        <w:t xml:space="preserve">Because the prospect opted in, you have express written consent on file — the compliant, TCPA-safe way to call or text. Every opt-in is stored with a signed receipt showing when and how consent was given.</w:t>
+      </w:r>
+    </w:p>
+    <w:p>
+      <w:pPr>
+        <w:pStyle w:val="ListParagraph"/>
+        <w:numPr>
+          <w:ilvl w:val="0"/>
+          <w:numId w:val="1"/>
+        </w:numPr>
+        <w:spacing w:after="70"/>
+      </w:pPr>
+      <w:r>
+        <w:rPr>
+          <w:rFonts w:ascii="Calibri" w:cs="Calibri" w:eastAsia="Calibri" w:hAnsi="Calibri"/>
+          <w:b/>
+          <w:bCs/>
+          <w:color w:val="0A2540"/>
+          <w:sz w:val="21"/>
+          <w:szCs w:val="21"/>
+        </w:rPr>
+        <w:t xml:space="preserve">Share it anywhere.  </w:t>
+      </w:r>
+      <w:r>
+        <w:rPr>
+          <w:rFonts w:ascii="Calibri" w:cs="Calibri" w:eastAsia="Calibri" w:hAnsi="Calibri"/>
+          <w:color w:val="28251D"/>
+          <w:sz w:val="21"/>
+          <w:szCs w:val="21"/>
+        </w:rPr>
+        <w:t xml:space="preserve">Share the form link in your email signature, on a flyer, or after a seminar. The leads land in your console under their own list, ready to call.</w:t>
       </w:r>
     </w:p>
     <w:p>

</xml_diff>

<commit_message>
docs: plain-English investor-ready tour (new button names, Rising Areas, Wealth Map, momentum/confidence)
</commit_message>
<xml_diff>
--- a/David_Leads_Access_and_Tour.docx
+++ b/David_Leads_Access_and_Tour.docx
@@ -81,7 +81,7 @@
           <w:sz w:val="21"/>
           <w:szCs w:val="21"/>
         </w:rPr>
-        <w:t xml:space="preserve">Everything you see is computed live from public records, ranked by fit and readiness, and every claim is cryptographically verifiable.</w:t>
+        <w:t xml:space="preserve">Everything you see is built live from public records, ranked so the best prospects rise to the top, and every lead comes with a proof trail you can open and check.</w:t>
       </w:r>
     </w:p>
     <w:p>
@@ -361,7 +361,7 @@
       <w:pPr>
         <w:spacing w:after="120" w:before="120"/>
       </w:pPr>
-      <w:hyperlink w:history="1" r:id="rIddeprpmedgym9dp4wkracg">
+      <w:hyperlink w:history="1" r:id="rIduxxvkqy2xzfuxeduhypsy">
         <w:r>
           <w:rPr>
             <w:rFonts w:ascii="Calibri" w:cs="Calibri" w:eastAsia="Calibri" w:hAnsi="Calibri"/>
@@ -429,16 +429,16 @@
           <w:sz w:val="21"/>
           <w:szCs w:val="21"/>
         </w:rPr>
-        <w:t xml:space="preserve">1. Run intelligence.  </w:t>
-      </w:r>
-      <w:r>
-        <w:rPr>
-          <w:rFonts w:ascii="Calibri" w:cs="Calibri" w:eastAsia="Calibri" w:hAnsi="Calibri"/>
-          <w:color w:val="28251D"/>
-          <w:sz w:val="21"/>
-          <w:szCs w:val="21"/>
-        </w:rPr>
-        <w:t xml:space="preserve">Click "Run Live Public-Data Intelligence." It pulls live signals from SEC EDGAR, U.S. Census, BLS wages, CDC, and 13 East-Coast state open-data portals (business formations, licenses, deeds, permits).</w:t>
+        <w:t xml:space="preserve">1. Find leads.  </w:t>
+      </w:r>
+      <w:r>
+        <w:rPr>
+          <w:rFonts w:ascii="Calibri" w:cs="Calibri" w:eastAsia="Calibri" w:hAnsi="Calibri"/>
+          <w:color w:val="28251D"/>
+          <w:sz w:val="21"/>
+          <w:szCs w:val="21"/>
+        </w:rPr>
+        <w:t xml:space="preserve">Click "Find Leads." In seconds it scans public records across the East Coast — new businesses, new licenses, home purchases, building permits, and more — and finds the people who just had a life event that creates an insurance need.</w:t>
       </w:r>
     </w:p>
     <w:p>
@@ -468,7 +468,7 @@
           <w:sz w:val="21"/>
           <w:szCs w:val="21"/>
         </w:rPr>
-        <w:t xml:space="preserve">Click "Territory Pulse" to see the 13-state Atlantic seaboard light up by activity. States with real live counts show the number; Massachusetts, New Hampshire, and Maine are shown honestly as data gaps — we never pretend to have data we don't.</w:t>
+        <w:t xml:space="preserve">Click "Coverage Map" to see your states light up by how much activity is happening. Where we don't yet have live data, we say so plainly — we never pretend to have data we don't.</w:t>
       </w:r>
     </w:p>
     <w:p>
@@ -498,7 +498,7 @@
           <w:sz w:val="21"/>
           <w:szCs w:val="21"/>
         </w:rPr>
-        <w:t xml:space="preserve">Each lead shows a HOT / WARM / NURTURE badge, the matched New York Life product, an estimated annual premium (illustrative), an urgency chip (ACT NOW means within the 48-hour window that converts best), a wealth tier, a lapse-risk indicator, a receptivity score, and a likely coverage gap.</w:t>
+        <w:t xml:space="preserve">Each lead shows a Hot / Warm / Nurture badge, the matched New York Life product, an illustrative annual premium, an "Act now" flag for time-sensitive ones, plus its momentum (heating up, cooling off, or steady), a confidence level (High / Medium), and how many public records confirm it. The strongest, best-confirmed leads rise to the top.</w:t>
       </w:r>
     </w:p>
     <w:p>
@@ -528,97 +528,97 @@
           <w:sz w:val="21"/>
           <w:szCs w:val="21"/>
         </w:rPr>
-        <w:t xml:space="preserve">Click the ▸ on any lead to see Why this lead (the scoring factors), the Predictive Moments timeline (the public sources that surfaced them), the wealth ladder, a Liquidity Watch, and your Next Best Action with a ready-to-use talk track.</w:t>
-      </w:r>
-    </w:p>
-    <w:p>
-      <w:pPr>
-        <w:pStyle w:val="ListParagraph"/>
-        <w:numPr>
-          <w:ilvl w:val="0"/>
-          <w:numId w:val="1"/>
-        </w:numPr>
-        <w:spacing w:after="70"/>
-      </w:pPr>
-      <w:r>
-        <w:rPr>
-          <w:rFonts w:ascii="Calibri" w:cs="Calibri" w:eastAsia="Calibri" w:hAnsi="Calibri"/>
-          <w:b/>
-          <w:bCs/>
-          <w:color w:val="0A2540"/>
-          <w:sz w:val="21"/>
-          <w:szCs w:val="21"/>
-        </w:rPr>
-        <w:t xml:space="preserve">5. Open the Signed 4-Part Brief.  </w:t>
-      </w:r>
-      <w:r>
-        <w:rPr>
-          <w:rFonts w:ascii="Calibri" w:cs="Calibri" w:eastAsia="Calibri" w:hAnsi="Calibri"/>
-          <w:color w:val="28251D"/>
-          <w:sz w:val="21"/>
-          <w:szCs w:val="21"/>
-        </w:rPr>
-        <w:t xml:space="preserve">Click "Signed Brief" on your top lead. You get four parts — Priority, Why now, three ranked Opening lines, and Sensitivity — each backed by a math-engine verdict (not an AI guess). Then click "Verify signed brief."</w:t>
-      </w:r>
-    </w:p>
-    <w:p>
-      <w:pPr>
-        <w:pStyle w:val="ListParagraph"/>
-        <w:numPr>
-          <w:ilvl w:val="0"/>
-          <w:numId w:val="1"/>
-        </w:numPr>
-        <w:spacing w:after="70"/>
-      </w:pPr>
-      <w:r>
-        <w:rPr>
-          <w:rFonts w:ascii="Calibri" w:cs="Calibri" w:eastAsia="Calibri" w:hAnsi="Calibri"/>
-          <w:b/>
-          <w:bCs/>
-          <w:color w:val="0A2540"/>
-          <w:sz w:val="21"/>
-          <w:szCs w:val="21"/>
-        </w:rPr>
-        <w:t xml:space="preserve">6. Verify the receipt.  </w:t>
-      </w:r>
-      <w:r>
-        <w:rPr>
-          <w:rFonts w:ascii="Calibri" w:cs="Calibri" w:eastAsia="Calibri" w:hAnsi="Calibri"/>
-          <w:color w:val="28251D"/>
-          <w:sz w:val="21"/>
-          <w:szCs w:val="21"/>
-        </w:rPr>
-        <w:t xml:space="preserve">Click "Verify Receipt" on any lead. You'll see a VERIFIED panel with five checks proving the data is tamper-evident, public, and never fabricated. This is what you can show compliance.</w:t>
-      </w:r>
-    </w:p>
-    <w:p>
-      <w:pPr>
-        <w:pStyle w:val="ListParagraph"/>
-        <w:numPr>
-          <w:ilvl w:val="0"/>
-          <w:numId w:val="1"/>
-        </w:numPr>
-        <w:spacing w:after="70"/>
-      </w:pPr>
-      <w:r>
-        <w:rPr>
-          <w:rFonts w:ascii="Calibri" w:cs="Calibri" w:eastAsia="Calibri" w:hAnsi="Calibri"/>
-          <w:b/>
-          <w:bCs/>
-          <w:color w:val="0A2540"/>
-          <w:sz w:val="21"/>
-          <w:szCs w:val="21"/>
-        </w:rPr>
-        <w:t xml:space="preserve">7. Open the Black Box &amp; export.  </w:t>
-      </w:r>
-      <w:r>
-        <w:rPr>
-          <w:rFonts w:ascii="Calibri" w:cs="Calibri" w:eastAsia="Calibri" w:hAnsi="Calibri"/>
-          <w:color w:val="28251D"/>
-          <w:sz w:val="21"/>
-          <w:szCs w:val="21"/>
-        </w:rPr>
-        <w:t xml:space="preserve">"Open the Black Box" shows the transparent scoring methodology (with its published reference, DOI 10.5281/zenodo.20434308). "Export Call List" downloads your ranked leads as a spreadsheet. "Push to CRM" sends enriched, receipted leads into your CRM.</w:t>
+        <w:t xml:space="preserve">Click the ▸ arrow on any lead to see why they surfaced, the public records behind them, an estimate of their wealth, and your next best action — with a ready-to-use talk track you can read straight off the screen.</w:t>
+      </w:r>
+    </w:p>
+    <w:p>
+      <w:pPr>
+        <w:pStyle w:val="ListParagraph"/>
+        <w:numPr>
+          <w:ilvl w:val="0"/>
+          <w:numId w:val="1"/>
+        </w:numPr>
+        <w:spacing w:after="70"/>
+      </w:pPr>
+      <w:r>
+        <w:rPr>
+          <w:rFonts w:ascii="Calibri" w:cs="Calibri" w:eastAsia="Calibri" w:hAnsi="Calibri"/>
+          <w:b/>
+          <w:bCs/>
+          <w:color w:val="0A2540"/>
+          <w:sz w:val="21"/>
+          <w:szCs w:val="21"/>
+        </w:rPr>
+        <w:t xml:space="preserve">5. Open the Call Brief.  </w:t>
+      </w:r>
+      <w:r>
+        <w:rPr>
+          <w:rFonts w:ascii="Calibri" w:cs="Calibri" w:eastAsia="Calibri" w:hAnsi="Calibri"/>
+          <w:color w:val="28251D"/>
+          <w:sz w:val="21"/>
+          <w:szCs w:val="21"/>
+        </w:rPr>
+        <w:t xml:space="preserve">Click "Call Brief" on your top lead. You get a short, ready-to-use brief — who to call, why now, three opening lines, and what to be sensitive about — so you can pick up the phone with confidence.</w:t>
+      </w:r>
+    </w:p>
+    <w:p>
+      <w:pPr>
+        <w:pStyle w:val="ListParagraph"/>
+        <w:numPr>
+          <w:ilvl w:val="0"/>
+          <w:numId w:val="1"/>
+        </w:numPr>
+        <w:spacing w:after="70"/>
+      </w:pPr>
+      <w:r>
+        <w:rPr>
+          <w:rFonts w:ascii="Calibri" w:cs="Calibri" w:eastAsia="Calibri" w:hAnsi="Calibri"/>
+          <w:b/>
+          <w:bCs/>
+          <w:color w:val="0A2540"/>
+          <w:sz w:val="21"/>
+          <w:szCs w:val="21"/>
+        </w:rPr>
+        <w:t xml:space="preserve">6. Check the proof.  </w:t>
+      </w:r>
+      <w:r>
+        <w:rPr>
+          <w:rFonts w:ascii="Calibri" w:cs="Calibri" w:eastAsia="Calibri" w:hAnsi="Calibri"/>
+          <w:color w:val="28251D"/>
+          <w:sz w:val="21"/>
+          <w:szCs w:val="21"/>
+        </w:rPr>
+        <w:t xml:space="preserve">Click "Proof &amp; Sources" on any lead. You'll see a clear panel confirming the lead comes from public records, lists every source, and shows nothing was invented. This is what you can show compliance.</w:t>
+      </w:r>
+    </w:p>
+    <w:p>
+      <w:pPr>
+        <w:pStyle w:val="ListParagraph"/>
+        <w:numPr>
+          <w:ilvl w:val="0"/>
+          <w:numId w:val="1"/>
+        </w:numPr>
+        <w:spacing w:after="70"/>
+      </w:pPr>
+      <w:r>
+        <w:rPr>
+          <w:rFonts w:ascii="Calibri" w:cs="Calibri" w:eastAsia="Calibri" w:hAnsi="Calibri"/>
+          <w:b/>
+          <w:bCs/>
+          <w:color w:val="0A2540"/>
+          <w:sz w:val="21"/>
+          <w:szCs w:val="21"/>
+        </w:rPr>
+        <w:t xml:space="preserve">7. See how it works &amp; export.  </w:t>
+      </w:r>
+      <w:r>
+        <w:rPr>
+          <w:rFonts w:ascii="Calibri" w:cs="Calibri" w:eastAsia="Calibri" w:hAnsi="Calibri"/>
+          <w:color w:val="28251D"/>
+          <w:sz w:val="21"/>
+          <w:szCs w:val="21"/>
+        </w:rPr>
+        <w:t xml:space="preserve">"How scoring works" explains, in plain English, the five things that make a lead strong and the public records behind each. "Export CSV" downloads your call list as a spreadsheet. "Push to CRM" sends your leads into your CRM.</w:t>
       </w:r>
     </w:p>
     <w:p>
@@ -653,26 +653,26 @@
           <w:sz w:val="19"/>
           <w:szCs w:val="19"/>
         </w:rPr>
-        <w:t xml:space="preserve">Click "Real Prospects" in the toolbar. This pulls REAL, currently-filed public business and professional-license records live from state portals (Delaware &amp; Connecticut to start) — actual businesses with their public business address and a suggested New York Life angle (key-person, buy-sell, business-continuation, disability overhead, or starter life + DI for new licensees).</w:t>
-      </w:r>
-    </w:p>
-    <w:p>
-      <w:pPr>
-        <w:pStyle w:val="ListParagraph"/>
-        <w:numPr>
-          <w:ilvl w:val="0"/>
-          <w:numId w:val="1"/>
-        </w:numPr>
-        <w:spacing w:after="70"/>
-      </w:pPr>
-      <w:r>
-        <w:rPr>
-          <w:rFonts w:ascii="Calibri" w:cs="Calibri" w:eastAsia="Calibri" w:hAnsi="Calibri"/>
-          <w:color w:val="28251D"/>
-          <w:sz w:val="21"/>
-          <w:szCs w:val="21"/>
-        </w:rPr>
-        <w:t xml:space="preserve">Each row is a real public record — real business name, category, public business address, and a link to the official source. Every row has a Verify button (signed receipt).</w:t>
+        <w:t xml:space="preserve">Click "Real Businesses" in the toolbar. This pulls real, currently-filed public business and professional-license records live from state portals across New York, New Jersey, Pennsylvania, Maryland, Delaware, and Connecticut — actual businesses with their public address and a suggested New York Life angle (key-person, buy-sell, business-continuation, disability overhead, or starter life + disability for newly-licensed professionals).</w:t>
+      </w:r>
+    </w:p>
+    <w:p>
+      <w:pPr>
+        <w:pStyle w:val="ListParagraph"/>
+        <w:numPr>
+          <w:ilvl w:val="0"/>
+          <w:numId w:val="1"/>
+        </w:numPr>
+        <w:spacing w:after="70"/>
+      </w:pPr>
+      <w:r>
+        <w:rPr>
+          <w:rFonts w:ascii="Calibri" w:cs="Calibri" w:eastAsia="Calibri" w:hAnsi="Calibri"/>
+          <w:color w:val="28251D"/>
+          <w:sz w:val="21"/>
+          <w:szCs w:val="21"/>
+        </w:rPr>
+        <w:t xml:space="preserve">Each row is a real public record — real business name, category, public business address, and a link to the official source. Every row has a "Proof &amp; Sources" button so you can see exactly where it came from.</w:t>
       </w:r>
     </w:p>
     <w:p>
@@ -751,7 +751,7 @@
           <w:sz w:val="26"/>
           <w:szCs w:val="26"/>
         </w:rPr>
-        <w:t xml:space="preserve">Tax-smart territories</w:t>
+        <w:t xml:space="preserve">Where need is rising</w:t>
       </w:r>
     </w:p>
     <w:p>
@@ -767,127 +767,7 @@
           <w:sz w:val="19"/>
           <w:szCs w:val="19"/>
         </w:rPr>
-        <w:t xml:space="preserve">Click "Tax Territories" in the toolbar. You asked whether taxes could help find leads — they can. This reads free public IRS tax statistics to point you at the right neighborhoods, never named individuals. Two views:</w:t>
-      </w:r>
-    </w:p>
-    <w:p>
-      <w:pPr>
-        <w:pStyle w:val="ListParagraph"/>
-        <w:numPr>
-          <w:ilvl w:val="0"/>
-          <w:numId w:val="1"/>
-        </w:numPr>
-        <w:spacing w:after="70"/>
-      </w:pPr>
-      <w:r>
-        <w:rPr>
-          <w:rFonts w:ascii="Calibri" w:cs="Calibri" w:eastAsia="Calibri" w:hAnsi="Calibri"/>
-          <w:b/>
-          <w:bCs/>
-          <w:color w:val="0A2540"/>
-          <w:sz w:val="21"/>
-          <w:szCs w:val="21"/>
-        </w:rPr>
-        <w:t xml:space="preserve">1. Affluent ZIPs.  </w:t>
-      </w:r>
-      <w:r>
-        <w:rPr>
-          <w:rFonts w:ascii="Calibri" w:cs="Calibri" w:eastAsia="Calibri" w:hAnsi="Calibri"/>
-          <w:color w:val="28251D"/>
-          <w:sz w:val="21"/>
-          <w:szCs w:val="21"/>
-        </w:rPr>
-        <w:t xml:space="preserve">Ranked ZIP codes where the most households file high-income returns ($200k+ adjusted gross income). Top of your list today is ZIP 10023 in Manhattan — about 11,500 high-income returns, roughly a third of all filers there. The suggested angle is estate planning, premium-financed life, and annuities. These are affluent-territory targets, drawn from IRS Statistics of Income by ZIP code.</w:t>
-      </w:r>
-    </w:p>
-    <w:p>
-      <w:pPr>
-        <w:pStyle w:val="ListParagraph"/>
-        <w:numPr>
-          <w:ilvl w:val="0"/>
-          <w:numId w:val="1"/>
-        </w:numPr>
-        <w:spacing w:after="70"/>
-      </w:pPr>
-      <w:r>
-        <w:rPr>
-          <w:rFonts w:ascii="Calibri" w:cs="Calibri" w:eastAsia="Calibri" w:hAnsi="Calibri"/>
-          <w:b/>
-          <w:bCs/>
-          <w:color w:val="0A2540"/>
-          <w:sz w:val="21"/>
-          <w:szCs w:val="21"/>
-        </w:rPr>
-        <w:t xml:space="preserve">2. Money-in-motion counties.  </w:t>
-      </w:r>
-      <w:r>
-        <w:rPr>
-          <w:rFonts w:ascii="Calibri" w:cs="Calibri" w:eastAsia="Calibri" w:hAnsi="Calibri"/>
-          <w:color w:val="28251D"/>
-          <w:sz w:val="21"/>
-          <w:szCs w:val="21"/>
-        </w:rPr>
-        <w:t xml:space="preserve">Counties seeing the biggest inflow of people and income from elsewhere — a relocation is a classic trigger for an estate and coverage review. Top today is New York County, with about $14.8 billion in adjusted gross income moving in (≈77,900 returns), drawn from IRS county-to-county migration data. The angle is a new-resident coverage review.</w:t>
-      </w:r>
-    </w:p>
-    <w:p>
-      <w:pPr>
-        <w:pStyle w:val="ListParagraph"/>
-        <w:numPr>
-          <w:ilvl w:val="0"/>
-          <w:numId w:val="1"/>
-        </w:numPr>
-        <w:spacing w:after="70"/>
-      </w:pPr>
-      <w:r>
-        <w:rPr>
-          <w:rFonts w:ascii="Calibri" w:cs="Calibri" w:eastAsia="Calibri" w:hAnsi="Calibri"/>
-          <w:b/>
-          <w:bCs/>
-          <w:color w:val="0A2540"/>
-          <w:sz w:val="21"/>
-          <w:szCs w:val="21"/>
-        </w:rPr>
-        <w:t xml:space="preserve">Compliant by design.  </w:t>
-      </w:r>
-      <w:r>
-        <w:rPr>
-          <w:rFonts w:ascii="Calibri" w:cs="Calibri" w:eastAsia="Calibri" w:hAnsi="Calibri"/>
-          <w:color w:val="28251D"/>
-          <w:sz w:val="21"/>
-          <w:szCs w:val="21"/>
-        </w:rPr>
-        <w:t xml:space="preserve">This uses aggregate IRS tax statistics for territory targeting only — it never names a person and never uses anyone's private tax data. It tells you where to focus, then you prospect compliantly in those areas.</w:t>
-      </w:r>
-    </w:p>
-    <w:p>
-      <w:pPr>
-        <w:pStyle w:val="ListParagraph"/>
-        <w:numPr>
-          <w:ilvl w:val="0"/>
-          <w:numId w:val="1"/>
-        </w:numPr>
-        <w:spacing w:after="70"/>
-      </w:pPr>
-      <w:r>
-        <w:rPr>
-          <w:rFonts w:ascii="Calibri" w:cs="Calibri" w:eastAsia="Calibri" w:hAnsi="Calibri"/>
-          <w:b/>
-          <w:bCs/>
-          <w:color w:val="0A2540"/>
-          <w:sz w:val="21"/>
-          <w:szCs w:val="21"/>
-        </w:rPr>
-        <w:t xml:space="preserve">Provable.  </w:t>
-      </w:r>
-      <w:r>
-        <w:rPr>
-          <w:rFonts w:ascii="Calibri" w:cs="Calibri" w:eastAsia="Calibri" w:hAnsi="Calibri"/>
-          <w:color w:val="28251D"/>
-          <w:sz w:val="21"/>
-          <w:szCs w:val="21"/>
-        </w:rPr>
-        <w:t xml:space="preserve">Every territory row links to the official IRS source and carries a signed receipt, same as your leads.</w:t>
+        <w:t xml:space="preserve">Click "Rising Areas" in the toolbar to see, at a glance, which areas have more new activity than usual right now — more new homeowners and businesses means more people who just took on a new obligation and need coverage. Each area is marked Rising, Steady, or Quiet, in plain language, with a link to the public source behind it. It tells you where to focus your week.</w:t>
       </w:r>
     </w:p>
     <w:p>
@@ -906,7 +786,7 @@
           <w:sz w:val="26"/>
           <w:szCs w:val="26"/>
         </w:rPr>
-        <w:t xml:space="preserve">Let prospects come to you</w:t>
+        <w:t xml:space="preserve">The wealth map</w:t>
       </w:r>
     </w:p>
     <w:p>
@@ -922,97 +802,127 @@
           <w:sz w:val="19"/>
           <w:szCs w:val="19"/>
         </w:rPr>
-        <w:t xml:space="preserve">Click "Opt-In Form" in the toolbar. This is the cleanest way to get a real name and a real phone number you can call — because the prospect gives it to you and asks to be contacted.</w:t>
-      </w:r>
-    </w:p>
-    <w:p>
-      <w:pPr>
-        <w:pStyle w:val="ListParagraph"/>
-        <w:numPr>
-          <w:ilvl w:val="0"/>
-          <w:numId w:val="1"/>
-        </w:numPr>
-        <w:spacing w:after="70"/>
-      </w:pPr>
-      <w:r>
-        <w:rPr>
-          <w:rFonts w:ascii="Calibri" w:cs="Calibri" w:eastAsia="Calibri" w:hAnsi="Calibri"/>
-          <w:b/>
-          <w:bCs/>
-          <w:color w:val="0A2540"/>
-          <w:sz w:val="21"/>
-          <w:szCs w:val="21"/>
-        </w:rPr>
-        <w:t xml:space="preserve">How it works.  </w:t>
-      </w:r>
-      <w:r>
-        <w:rPr>
-          <w:rFonts w:ascii="Calibri" w:cs="Calibri" w:eastAsia="Calibri" w:hAnsi="Calibri"/>
-          <w:color w:val="28251D"/>
-          <w:sz w:val="21"/>
-          <w:szCs w:val="21"/>
-        </w:rPr>
-        <w:t xml:space="preserve">Anyone interested fills in their name, phone, email, and a note, and checks a box consenting to be contacted. Their details are only saved if they check that box — no consent, nothing is stored.</w:t>
-      </w:r>
-    </w:p>
-    <w:p>
-      <w:pPr>
-        <w:pStyle w:val="ListParagraph"/>
-        <w:numPr>
-          <w:ilvl w:val="0"/>
-          <w:numId w:val="1"/>
-        </w:numPr>
-        <w:spacing w:after="70"/>
-      </w:pPr>
-      <w:r>
-        <w:rPr>
-          <w:rFonts w:ascii="Calibri" w:cs="Calibri" w:eastAsia="Calibri" w:hAnsi="Calibri"/>
-          <w:b/>
-          <w:bCs/>
-          <w:color w:val="0A2540"/>
-          <w:sz w:val="21"/>
-          <w:szCs w:val="21"/>
-        </w:rPr>
-        <w:t xml:space="preserve">Call-ready &amp; TCPA-safe.  </w:t>
-      </w:r>
-      <w:r>
-        <w:rPr>
-          <w:rFonts w:ascii="Calibri" w:cs="Calibri" w:eastAsia="Calibri" w:hAnsi="Calibri"/>
-          <w:color w:val="28251D"/>
-          <w:sz w:val="21"/>
-          <w:szCs w:val="21"/>
-        </w:rPr>
-        <w:t xml:space="preserve">Because the prospect opted in, you have express written consent on file — the compliant, TCPA-safe way to call or text. Every opt-in is stored with a signed receipt showing when and how consent was given.</w:t>
-      </w:r>
-    </w:p>
-    <w:p>
-      <w:pPr>
-        <w:pStyle w:val="ListParagraph"/>
-        <w:numPr>
-          <w:ilvl w:val="0"/>
-          <w:numId w:val="1"/>
-        </w:numPr>
-        <w:spacing w:after="70"/>
-      </w:pPr>
-      <w:r>
-        <w:rPr>
-          <w:rFonts w:ascii="Calibri" w:cs="Calibri" w:eastAsia="Calibri" w:hAnsi="Calibri"/>
-          <w:b/>
-          <w:bCs/>
-          <w:color w:val="0A2540"/>
-          <w:sz w:val="21"/>
-          <w:szCs w:val="21"/>
-        </w:rPr>
-        <w:t xml:space="preserve">Share it anywhere.  </w:t>
-      </w:r>
-      <w:r>
-        <w:rPr>
-          <w:rFonts w:ascii="Calibri" w:cs="Calibri" w:eastAsia="Calibri" w:hAnsi="Calibri"/>
-          <w:color w:val="28251D"/>
-          <w:sz w:val="21"/>
-          <w:szCs w:val="21"/>
-        </w:rPr>
-        <w:t xml:space="preserve">Share the form link in your email signature, on a flyer, or after a seminar. The leads land in your console under their own list, ready to call.</w:t>
+        <w:t xml:space="preserve">Click "Wealth Map" in the toolbar. You asked whether taxes could help find leads — they can. This reads free public IRS tax statistics to point you at the right neighborhoods, never named individuals. Two views:</w:t>
+      </w:r>
+    </w:p>
+    <w:p>
+      <w:pPr>
+        <w:pStyle w:val="ListParagraph"/>
+        <w:numPr>
+          <w:ilvl w:val="0"/>
+          <w:numId w:val="1"/>
+        </w:numPr>
+        <w:spacing w:after="70"/>
+      </w:pPr>
+      <w:r>
+        <w:rPr>
+          <w:rFonts w:ascii="Calibri" w:cs="Calibri" w:eastAsia="Calibri" w:hAnsi="Calibri"/>
+          <w:b/>
+          <w:bCs/>
+          <w:color w:val="0A2540"/>
+          <w:sz w:val="21"/>
+          <w:szCs w:val="21"/>
+        </w:rPr>
+        <w:t xml:space="preserve">1. Affluent ZIPs.  </w:t>
+      </w:r>
+      <w:r>
+        <w:rPr>
+          <w:rFonts w:ascii="Calibri" w:cs="Calibri" w:eastAsia="Calibri" w:hAnsi="Calibri"/>
+          <w:color w:val="28251D"/>
+          <w:sz w:val="21"/>
+          <w:szCs w:val="21"/>
+        </w:rPr>
+        <w:t xml:space="preserve">Ranked ZIP codes where the most households file high-income returns ($200k+ adjusted gross income). Top of your list today is ZIP 10023 in Manhattan — about 11,500 high-income returns, roughly a third of all filers there. The suggested angle is estate planning, premium-financed life, and annuities. These are affluent-territory targets, drawn from IRS Statistics of Income by ZIP code.</w:t>
+      </w:r>
+    </w:p>
+    <w:p>
+      <w:pPr>
+        <w:pStyle w:val="ListParagraph"/>
+        <w:numPr>
+          <w:ilvl w:val="0"/>
+          <w:numId w:val="1"/>
+        </w:numPr>
+        <w:spacing w:after="70"/>
+      </w:pPr>
+      <w:r>
+        <w:rPr>
+          <w:rFonts w:ascii="Calibri" w:cs="Calibri" w:eastAsia="Calibri" w:hAnsi="Calibri"/>
+          <w:b/>
+          <w:bCs/>
+          <w:color w:val="0A2540"/>
+          <w:sz w:val="21"/>
+          <w:szCs w:val="21"/>
+        </w:rPr>
+        <w:t xml:space="preserve">2. Money-in-motion counties.  </w:t>
+      </w:r>
+      <w:r>
+        <w:rPr>
+          <w:rFonts w:ascii="Calibri" w:cs="Calibri" w:eastAsia="Calibri" w:hAnsi="Calibri"/>
+          <w:color w:val="28251D"/>
+          <w:sz w:val="21"/>
+          <w:szCs w:val="21"/>
+        </w:rPr>
+        <w:t xml:space="preserve">Counties seeing the biggest inflow of people and income from elsewhere — a relocation is a classic trigger for an estate and coverage review. Top today is New York County, with about $14.8 billion in adjusted gross income moving in (≈77,900 returns), drawn from IRS county-to-county migration data. The angle is a new-resident coverage review.</w:t>
+      </w:r>
+    </w:p>
+    <w:p>
+      <w:pPr>
+        <w:pStyle w:val="ListParagraph"/>
+        <w:numPr>
+          <w:ilvl w:val="0"/>
+          <w:numId w:val="1"/>
+        </w:numPr>
+        <w:spacing w:after="70"/>
+      </w:pPr>
+      <w:r>
+        <w:rPr>
+          <w:rFonts w:ascii="Calibri" w:cs="Calibri" w:eastAsia="Calibri" w:hAnsi="Calibri"/>
+          <w:b/>
+          <w:bCs/>
+          <w:color w:val="0A2540"/>
+          <w:sz w:val="21"/>
+          <w:szCs w:val="21"/>
+        </w:rPr>
+        <w:t xml:space="preserve">Compliant by design.  </w:t>
+      </w:r>
+      <w:r>
+        <w:rPr>
+          <w:rFonts w:ascii="Calibri" w:cs="Calibri" w:eastAsia="Calibri" w:hAnsi="Calibri"/>
+          <w:color w:val="28251D"/>
+          <w:sz w:val="21"/>
+          <w:szCs w:val="21"/>
+        </w:rPr>
+        <w:t xml:space="preserve">This uses aggregate IRS tax statistics for territory targeting only — it never names a person and never uses anyone's private tax data. It tells you where to focus, then you prospect compliantly in those areas.</w:t>
+      </w:r>
+    </w:p>
+    <w:p>
+      <w:pPr>
+        <w:pStyle w:val="ListParagraph"/>
+        <w:numPr>
+          <w:ilvl w:val="0"/>
+          <w:numId w:val="1"/>
+        </w:numPr>
+        <w:spacing w:after="70"/>
+      </w:pPr>
+      <w:r>
+        <w:rPr>
+          <w:rFonts w:ascii="Calibri" w:cs="Calibri" w:eastAsia="Calibri" w:hAnsi="Calibri"/>
+          <w:b/>
+          <w:bCs/>
+          <w:color w:val="0A2540"/>
+          <w:sz w:val="21"/>
+          <w:szCs w:val="21"/>
+        </w:rPr>
+        <w:t xml:space="preserve">Provable.  </w:t>
+      </w:r>
+      <w:r>
+        <w:rPr>
+          <w:rFonts w:ascii="Calibri" w:cs="Calibri" w:eastAsia="Calibri" w:hAnsi="Calibri"/>
+          <w:color w:val="28251D"/>
+          <w:sz w:val="21"/>
+          <w:szCs w:val="21"/>
+        </w:rPr>
+        <w:t xml:space="preserve">Every row links to the official IRS source so you can check it yourself, same as your leads.</w:t>
       </w:r>
     </w:p>
     <w:p>
@@ -1031,127 +941,113 @@
           <w:sz w:val="26"/>
           <w:szCs w:val="26"/>
         </w:rPr>
-        <w:t xml:space="preserve">What makes this different</w:t>
-      </w:r>
-    </w:p>
-    <w:p>
-      <w:pPr>
-        <w:pStyle w:val="ListParagraph"/>
-        <w:numPr>
-          <w:ilvl w:val="0"/>
-          <w:numId w:val="1"/>
-        </w:numPr>
-        <w:spacing w:after="70"/>
-      </w:pPr>
-      <w:r>
-        <w:rPr>
-          <w:rFonts w:ascii="Calibri" w:cs="Calibri" w:eastAsia="Calibri" w:hAnsi="Calibri"/>
-          <w:b/>
-          <w:bCs/>
-          <w:color w:val="0A2540"/>
-          <w:sz w:val="21"/>
-          <w:szCs w:val="21"/>
-        </w:rPr>
-        <w:t xml:space="preserve">Provable.  </w:t>
-      </w:r>
-      <w:r>
-        <w:rPr>
-          <w:rFonts w:ascii="Calibri" w:cs="Calibri" w:eastAsia="Calibri" w:hAnsi="Calibri"/>
-          <w:color w:val="28251D"/>
-          <w:sz w:val="21"/>
-          <w:szCs w:val="21"/>
-        </w:rPr>
-        <w:t xml:space="preserve">Every lead and brief carries a verifiable, signed receipt — you can prove to compliance exactly where each claim came from.</w:t>
-      </w:r>
-    </w:p>
-    <w:p>
-      <w:pPr>
-        <w:pStyle w:val="ListParagraph"/>
-        <w:numPr>
-          <w:ilvl w:val="0"/>
-          <w:numId w:val="1"/>
-        </w:numPr>
-        <w:spacing w:after="70"/>
-      </w:pPr>
-      <w:r>
-        <w:rPr>
-          <w:rFonts w:ascii="Calibri" w:cs="Calibri" w:eastAsia="Calibri" w:hAnsi="Calibri"/>
-          <w:b/>
-          <w:bCs/>
-          <w:color w:val="0A2540"/>
-          <w:sz w:val="21"/>
-          <w:szCs w:val="21"/>
-        </w:rPr>
-        <w:t xml:space="preserve">Public-data only.  </w:t>
-      </w:r>
-      <w:r>
-        <w:rPr>
-          <w:rFonts w:ascii="Calibri" w:cs="Calibri" w:eastAsia="Calibri" w:hAnsi="Calibri"/>
-          <w:color w:val="28251D"/>
-          <w:sz w:val="21"/>
-          <w:szCs w:val="21"/>
-        </w:rPr>
-        <w:t xml:space="preserve">It only uses free, public, aggregate data. No private personal information, ever.</w:t>
-      </w:r>
-    </w:p>
-    <w:p>
-      <w:pPr>
-        <w:pStyle w:val="ListParagraph"/>
-        <w:numPr>
-          <w:ilvl w:val="0"/>
-          <w:numId w:val="1"/>
-        </w:numPr>
-        <w:spacing w:after="70"/>
-      </w:pPr>
-      <w:r>
-        <w:rPr>
-          <w:rFonts w:ascii="Calibri" w:cs="Calibri" w:eastAsia="Calibri" w:hAnsi="Calibri"/>
-          <w:b/>
-          <w:bCs/>
-          <w:color w:val="0A2540"/>
-          <w:sz w:val="21"/>
-          <w:szCs w:val="21"/>
-        </w:rPr>
-        <w:t xml:space="preserve">Transparent.  </w:t>
-      </w:r>
-      <w:r>
-        <w:rPr>
-          <w:rFonts w:ascii="Calibri" w:cs="Calibri" w:eastAsia="Calibri" w:hAnsi="Calibri"/>
-          <w:color w:val="28251D"/>
-          <w:sz w:val="21"/>
-          <w:szCs w:val="21"/>
-        </w:rPr>
-        <w:t xml:space="preserve">The scoring model is open and citable — no hidden black box.</w:t>
-      </w:r>
-    </w:p>
-    <w:p>
-      <w:pPr>
-        <w:pStyle w:val="ListParagraph"/>
-        <w:numPr>
-          <w:ilvl w:val="0"/>
-          <w:numId w:val="1"/>
-        </w:numPr>
-        <w:spacing w:after="70"/>
-      </w:pPr>
-      <w:r>
-        <w:rPr>
-          <w:rFonts w:ascii="Calibri" w:cs="Calibri" w:eastAsia="Calibri" w:hAnsi="Calibri"/>
-          <w:b/>
-          <w:bCs/>
-          <w:color w:val="0A2540"/>
-          <w:sz w:val="21"/>
-          <w:szCs w:val="21"/>
-        </w:rPr>
-        <w:t xml:space="preserve">Actionable.  </w:t>
-      </w:r>
-      <w:r>
-        <w:rPr>
-          <w:rFonts w:ascii="Calibri" w:cs="Calibri" w:eastAsia="Calibri" w:hAnsi="Calibri"/>
-          <w:color w:val="28251D"/>
-          <w:sz w:val="21"/>
-          <w:szCs w:val="21"/>
-        </w:rPr>
-        <w:t xml:space="preserve">It tells you not just who, but when to reach them and what to say.</w:t>
+        <w:t xml:space="preserve">Let prospects come to you</w:t>
+      </w:r>
+    </w:p>
+    <w:p>
+      <w:pPr>
+        <w:spacing w:after="120"/>
+      </w:pPr>
+      <w:r>
+        <w:rPr>
+          <w:rFonts w:ascii="Calibri" w:cs="Calibri" w:eastAsia="Calibri" w:hAnsi="Calibri"/>
+          <w:i/>
+          <w:iCs/>
+          <w:color w:val="5A6B7C"/>
+          <w:sz w:val="19"/>
+          <w:szCs w:val="19"/>
+        </w:rPr>
+        <w:t xml:space="preserve">Click "Opt-In" in the toolbar. This is the cleanest way to get a real name and a real phone number you can call — because the prospect gives it to you and asks to be contacted.</w:t>
+      </w:r>
+    </w:p>
+    <w:p>
+      <w:pPr>
+        <w:pStyle w:val="ListParagraph"/>
+        <w:numPr>
+          <w:ilvl w:val="0"/>
+          <w:numId w:val="1"/>
+        </w:numPr>
+        <w:spacing w:after="70"/>
+      </w:pPr>
+      <w:r>
+        <w:rPr>
+          <w:rFonts w:ascii="Calibri" w:cs="Calibri" w:eastAsia="Calibri" w:hAnsi="Calibri"/>
+          <w:b/>
+          <w:bCs/>
+          <w:color w:val="0A2540"/>
+          <w:sz w:val="21"/>
+          <w:szCs w:val="21"/>
+        </w:rPr>
+        <w:t xml:space="preserve">How it works.  </w:t>
+      </w:r>
+      <w:r>
+        <w:rPr>
+          <w:rFonts w:ascii="Calibri" w:cs="Calibri" w:eastAsia="Calibri" w:hAnsi="Calibri"/>
+          <w:color w:val="28251D"/>
+          <w:sz w:val="21"/>
+          <w:szCs w:val="21"/>
+        </w:rPr>
+        <w:t xml:space="preserve">Anyone interested fills in their name, phone, email, and a note, and checks a box consenting to be contacted. Their details are only saved if they check that box — no consent, nothing is stored.</w:t>
+      </w:r>
+    </w:p>
+    <w:p>
+      <w:pPr>
+        <w:pStyle w:val="ListParagraph"/>
+        <w:numPr>
+          <w:ilvl w:val="0"/>
+          <w:numId w:val="1"/>
+        </w:numPr>
+        <w:spacing w:after="70"/>
+      </w:pPr>
+      <w:r>
+        <w:rPr>
+          <w:rFonts w:ascii="Calibri" w:cs="Calibri" w:eastAsia="Calibri" w:hAnsi="Calibri"/>
+          <w:b/>
+          <w:bCs/>
+          <w:color w:val="0A2540"/>
+          <w:sz w:val="21"/>
+          <w:szCs w:val="21"/>
+        </w:rPr>
+        <w:t xml:space="preserve">Call-ready &amp; compliant.  </w:t>
+      </w:r>
+      <w:r>
+        <w:rPr>
+          <w:rFonts w:ascii="Calibri" w:cs="Calibri" w:eastAsia="Calibri" w:hAnsi="Calibri"/>
+          <w:color w:val="28251D"/>
+          <w:sz w:val="21"/>
+          <w:szCs w:val="21"/>
+        </w:rPr>
+        <w:t xml:space="preserve">Because the prospect opted in, you have written consent on file — the compliant, safe way to call or text. Every opt-in is saved with a record of when and how consent was given.</w:t>
+      </w:r>
+    </w:p>
+    <w:p>
+      <w:pPr>
+        <w:pStyle w:val="ListParagraph"/>
+        <w:numPr>
+          <w:ilvl w:val="0"/>
+          <w:numId w:val="1"/>
+        </w:numPr>
+        <w:spacing w:after="70"/>
+      </w:pPr>
+      <w:r>
+        <w:rPr>
+          <w:rFonts w:ascii="Calibri" w:cs="Calibri" w:eastAsia="Calibri" w:hAnsi="Calibri"/>
+          <w:b/>
+          <w:bCs/>
+          <w:color w:val="0A2540"/>
+          <w:sz w:val="21"/>
+          <w:szCs w:val="21"/>
+        </w:rPr>
+        <w:t xml:space="preserve">Share it anywhere.  </w:t>
+      </w:r>
+      <w:r>
+        <w:rPr>
+          <w:rFonts w:ascii="Calibri" w:cs="Calibri" w:eastAsia="Calibri" w:hAnsi="Calibri"/>
+          <w:color w:val="28251D"/>
+          <w:sz w:val="21"/>
+          <w:szCs w:val="21"/>
+        </w:rPr>
+        <w:t xml:space="preserve">Share the form link in your email signature, on a flyer, or after a seminar. The leads land in your console under their own list, ready to call.</w:t>
       </w:r>
     </w:p>
     <w:p>
@@ -1170,6 +1066,145 @@
           <w:sz w:val="26"/>
           <w:szCs w:val="26"/>
         </w:rPr>
+        <w:t xml:space="preserve">What makes this different</w:t>
+      </w:r>
+    </w:p>
+    <w:p>
+      <w:pPr>
+        <w:pStyle w:val="ListParagraph"/>
+        <w:numPr>
+          <w:ilvl w:val="0"/>
+          <w:numId w:val="1"/>
+        </w:numPr>
+        <w:spacing w:after="70"/>
+      </w:pPr>
+      <w:r>
+        <w:rPr>
+          <w:rFonts w:ascii="Calibri" w:cs="Calibri" w:eastAsia="Calibri" w:hAnsi="Calibri"/>
+          <w:b/>
+          <w:bCs/>
+          <w:color w:val="0A2540"/>
+          <w:sz w:val="21"/>
+          <w:szCs w:val="21"/>
+        </w:rPr>
+        <w:t xml:space="preserve">Provable.  </w:t>
+      </w:r>
+      <w:r>
+        <w:rPr>
+          <w:rFonts w:ascii="Calibri" w:cs="Calibri" w:eastAsia="Calibri" w:hAnsi="Calibri"/>
+          <w:color w:val="28251D"/>
+          <w:sz w:val="21"/>
+          <w:szCs w:val="21"/>
+        </w:rPr>
+        <w:t xml:space="preserve">Every lead carries a proof trail — you can show compliance exactly where each detail came from.</w:t>
+      </w:r>
+    </w:p>
+    <w:p>
+      <w:pPr>
+        <w:pStyle w:val="ListParagraph"/>
+        <w:numPr>
+          <w:ilvl w:val="0"/>
+          <w:numId w:val="1"/>
+        </w:numPr>
+        <w:spacing w:after="70"/>
+      </w:pPr>
+      <w:r>
+        <w:rPr>
+          <w:rFonts w:ascii="Calibri" w:cs="Calibri" w:eastAsia="Calibri" w:hAnsi="Calibri"/>
+          <w:b/>
+          <w:bCs/>
+          <w:color w:val="0A2540"/>
+          <w:sz w:val="21"/>
+          <w:szCs w:val="21"/>
+        </w:rPr>
+        <w:t xml:space="preserve">Public-data only.  </w:t>
+      </w:r>
+      <w:r>
+        <w:rPr>
+          <w:rFonts w:ascii="Calibri" w:cs="Calibri" w:eastAsia="Calibri" w:hAnsi="Calibri"/>
+          <w:color w:val="28251D"/>
+          <w:sz w:val="21"/>
+          <w:szCs w:val="21"/>
+        </w:rPr>
+        <w:t xml:space="preserve">It only uses free, public information. No private personal data, ever. Anyone who can't be contacted is removed automatically.</w:t>
+      </w:r>
+    </w:p>
+    <w:p>
+      <w:pPr>
+        <w:pStyle w:val="ListParagraph"/>
+        <w:numPr>
+          <w:ilvl w:val="0"/>
+          <w:numId w:val="1"/>
+        </w:numPr>
+        <w:spacing w:after="70"/>
+      </w:pPr>
+      <w:r>
+        <w:rPr>
+          <w:rFonts w:ascii="Calibri" w:cs="Calibri" w:eastAsia="Calibri" w:hAnsi="Calibri"/>
+          <w:b/>
+          <w:bCs/>
+          <w:color w:val="0A2540"/>
+          <w:sz w:val="21"/>
+          <w:szCs w:val="21"/>
+        </w:rPr>
+        <w:t xml:space="preserve">Transparent.  </w:t>
+      </w:r>
+      <w:r>
+        <w:rPr>
+          <w:rFonts w:ascii="Calibri" w:cs="Calibri" w:eastAsia="Calibri" w:hAnsi="Calibri"/>
+          <w:color w:val="28251D"/>
+          <w:sz w:val="21"/>
+          <w:szCs w:val="21"/>
+        </w:rPr>
+        <w:t xml:space="preserve">Nothing is hidden — "How scoring works" explains, in plain English, exactly what makes a lead strong.</w:t>
+      </w:r>
+    </w:p>
+    <w:p>
+      <w:pPr>
+        <w:pStyle w:val="ListParagraph"/>
+        <w:numPr>
+          <w:ilvl w:val="0"/>
+          <w:numId w:val="1"/>
+        </w:numPr>
+        <w:spacing w:after="70"/>
+      </w:pPr>
+      <w:r>
+        <w:rPr>
+          <w:rFonts w:ascii="Calibri" w:cs="Calibri" w:eastAsia="Calibri" w:hAnsi="Calibri"/>
+          <w:b/>
+          <w:bCs/>
+          <w:color w:val="0A2540"/>
+          <w:sz w:val="21"/>
+          <w:szCs w:val="21"/>
+        </w:rPr>
+        <w:t xml:space="preserve">Actionable.  </w:t>
+      </w:r>
+      <w:r>
+        <w:rPr>
+          <w:rFonts w:ascii="Calibri" w:cs="Calibri" w:eastAsia="Calibri" w:hAnsi="Calibri"/>
+          <w:color w:val="28251D"/>
+          <w:sz w:val="21"/>
+          <w:szCs w:val="21"/>
+        </w:rPr>
+        <w:t xml:space="preserve">It tells you not just who, but when to reach them and what to say.</w:t>
+      </w:r>
+    </w:p>
+    <w:p>
+      <w:pPr>
+        <w:pBdr>
+          <w:bottom w:val="single" w:color="D4D1CA" w:sz="6" w:space="4"/>
+        </w:pBdr>
+        <w:spacing w:after="100" w:before="260"/>
+      </w:pPr>
+      <w:r>
+        <w:rPr>
+          <w:rFonts w:ascii="Calibri" w:cs="Calibri" w:eastAsia="Calibri" w:hAnsi="Calibri"/>
+          <w:b/>
+          <w:bCs/>
+          <w:color w:val="0A2540"/>
+          <w:sz w:val="26"/>
+          <w:szCs w:val="26"/>
+        </w:rPr>
         <w:t xml:space="preserve">A few honest notes</w:t>
       </w:r>
     </w:p>
@@ -1227,26 +1262,45 @@
           <w:sz w:val="21"/>
           <w:szCs w:val="21"/>
         </w:rPr>
-        <w:t xml:space="preserve">Lapse-risk is advisory only — it is not a credit or FCRA decision.</w:t>
-      </w:r>
-    </w:p>
-    <w:p>
-      <w:pPr>
-        <w:pStyle w:val="ListParagraph"/>
-        <w:numPr>
-          <w:ilvl w:val="0"/>
-          <w:numId w:val="1"/>
-        </w:numPr>
-        <w:spacing w:after="70"/>
-      </w:pPr>
-      <w:r>
-        <w:rPr>
-          <w:rFonts w:ascii="Calibri" w:cs="Calibri" w:eastAsia="Calibri" w:hAnsi="Calibri"/>
-          <w:color w:val="28251D"/>
-          <w:sz w:val="21"/>
-          <w:szCs w:val="21"/>
-        </w:rPr>
-        <w:t xml:space="preserve">If a state or signal shows "sample" or "gap," that is the system being honest about what it could and couldn't pull live.</w:t>
+        <w:t xml:space="preserve">The lapse-risk indicator is a guide only — it is not a credit decision and uses no credit data.</w:t>
+      </w:r>
+    </w:p>
+    <w:p>
+      <w:pPr>
+        <w:pStyle w:val="ListParagraph"/>
+        <w:numPr>
+          <w:ilvl w:val="0"/>
+          <w:numId w:val="1"/>
+        </w:numPr>
+        <w:spacing w:after="70"/>
+      </w:pPr>
+      <w:r>
+        <w:rPr>
+          <w:rFonts w:ascii="Calibri" w:cs="Calibri" w:eastAsia="Calibri" w:hAnsi="Calibri"/>
+          <w:color w:val="28251D"/>
+          <w:sz w:val="21"/>
+          <w:szCs w:val="21"/>
+        </w:rPr>
+        <w:t xml:space="preserve">When an area or source is marked "example" or "not yet covered," that is the system being honest about what it could and couldn't pull live — it never pretends.</w:t>
+      </w:r>
+    </w:p>
+    <w:p>
+      <w:pPr>
+        <w:pStyle w:val="ListParagraph"/>
+        <w:numPr>
+          <w:ilvl w:val="0"/>
+          <w:numId w:val="1"/>
+        </w:numPr>
+        <w:spacing w:after="70"/>
+      </w:pPr>
+      <w:r>
+        <w:rPr>
+          <w:rFonts w:ascii="Calibri" w:cs="Calibri" w:eastAsia="Calibri" w:hAnsi="Calibri"/>
+          <w:color w:val="28251D"/>
+          <w:sz w:val="21"/>
+          <w:szCs w:val="21"/>
+        </w:rPr>
+        <w:t xml:space="preserve">Confidence levels (High / Medium) reflect how many public records confirm a lead — more confirming records means higher confidence. They are honest estimates, not guarantees.</w:t>
       </w:r>
     </w:p>
     <w:p>

</xml_diff>

<commit_message>
feat: launch governed opportunity desk
Signed-off-by: Lutar, Stephen P. <stephenlutar2@gmail.com>
</commit_message>
<xml_diff>
--- a/David_Leads_Access_and_Tour.docx
+++ b/David_Leads_Access_and_Tour.docx
@@ -230,7 +230,7 @@
                 <w:sz w:val="21"/>
                 <w:szCs w:val="21"/>
               </w:rPr>
-              <w:t xml:space="preserve">Username</w:t>
+              <w:t xml:space="preserve">Credentials</w:t>
             </w:r>
           </w:p>
         </w:tc>
@@ -253,7 +253,7 @@
                 <w:sz w:val="21"/>
                 <w:szCs w:val="21"/>
               </w:rPr>
-              <w:t xml:space="preserve">david</w:t>
+              <w:t xml:space="preserve">Retrieve from Stephen's approved secret store</w:t>
             </w:r>
           </w:p>
         </w:tc>
@@ -279,7 +279,7 @@
                 <w:sz w:val="21"/>
                 <w:szCs w:val="21"/>
               </w:rPr>
-              <w:t xml:space="preserve">Password</w:t>
+              <w:t xml:space="preserve">Security</w:t>
             </w:r>
           </w:p>
         </w:tc>
@@ -302,56 +302,7 @@
                 <w:sz w:val="21"/>
                 <w:szCs w:val="21"/>
               </w:rPr>
-              <w:t xml:space="preserve">David2026!</w:t>
-            </w:r>
-          </w:p>
-        </w:tc>
-      </w:tr>
-      <w:tr>
-        <w:tc>
-          <w:tcPr>
-            <w:shd w:fill="EFF3F8" w:val="clear"/>
-            <w:tcMar>
-              <w:top w:type="dxa" w:w="80"/>
-              <w:left w:type="dxa" w:w="120"/>
-              <w:bottom w:type="dxa" w:w="80"/>
-              <w:right w:type="dxa" w:w="120"/>
-            </w:tcMar>
-          </w:tcPr>
-          <w:p>
-            <w:r>
-              <w:rPr>
-                <w:rFonts w:ascii="Calibri" w:cs="Calibri" w:eastAsia="Calibri" w:hAnsi="Calibri"/>
-                <w:b/>
-                <w:bCs/>
-                <w:color w:val="0A2540"/>
-                <w:sz w:val="21"/>
-                <w:szCs w:val="21"/>
-              </w:rPr>
-              <w:t xml:space="preserve">Secure access key</w:t>
-            </w:r>
-          </w:p>
-        </w:tc>
-        <w:tc>
-          <w:tcPr>
-            <w:tcMar>
-              <w:top w:type="dxa" w:w="80"/>
-              <w:left w:type="dxa" w:w="120"/>
-              <w:bottom w:type="dxa" w:w="80"/>
-              <w:right w:type="dxa" w:w="120"/>
-            </w:tcMar>
-          </w:tcPr>
-          <w:p>
-            <w:r>
-              <w:rPr>
-                <w:rFonts w:ascii="Calibri" w:cs="Calibri" w:eastAsia="Calibri" w:hAnsi="Calibri"/>
-                <w:b/>
-                <w:bCs/>
-                <w:color w:val="28251D"/>
-                <w:sz w:val="21"/>
-                <w:szCs w:val="21"/>
-              </w:rPr>
-              <w:t xml:space="preserve">DAVID-2026-SECURE-DEMO</w:t>
+              <w:t xml:space="preserve">Never share credentials in email, chat, or public documents</w:t>
             </w:r>
           </w:p>
         </w:tc>
@@ -361,7 +312,7 @@
       <w:pPr>
         <w:spacing w:after="120" w:before="120"/>
       </w:pPr>
-      <w:hyperlink w:history="1" r:id="rIduxxvkqy2xzfuxeduhypsy">
+      <w:hyperlink w:history="1" r:id="rIdsbzl-ayavqcqlre9wpori">
         <w:r>
           <w:rPr>
             <w:rFonts w:ascii="Calibri" w:cs="Calibri" w:eastAsia="Calibri" w:hAnsi="Calibri"/>

</xml_diff>

<commit_message>
feat: launch governed broker opportunity desk (#35)
* feat: launch governed opportunity desk

Build the governed public-record research queue and source-policy controls.

Add receipt truth states, session and webhook hardening, exact runtime provenance, and safety coverage.

Revoke stale contact clearance when a record returns to research.

Keep in-memory clearance unchanged when durable persistence fails.

Signed-off-by: Lutar, Stephen P. <stephenlutar2@gmail.com>

* feat: add official-data frontier radar

Signed-off-by: Lutar, Stephen P. <stephenlutar2@gmail.com>

---------

Signed-off-by: Lutar, Stephen P. <stephenlutar2@gmail.com>
</commit_message>
<xml_diff>
--- a/David_Leads_Access_and_Tour.docx
+++ b/David_Leads_Access_and_Tour.docx
@@ -230,7 +230,7 @@
                 <w:sz w:val="21"/>
                 <w:szCs w:val="21"/>
               </w:rPr>
-              <w:t xml:space="preserve">Username</w:t>
+              <w:t xml:space="preserve">Credentials</w:t>
             </w:r>
           </w:p>
         </w:tc>
@@ -253,7 +253,7 @@
                 <w:sz w:val="21"/>
                 <w:szCs w:val="21"/>
               </w:rPr>
-              <w:t xml:space="preserve">david</w:t>
+              <w:t xml:space="preserve">Retrieve from Stephen's approved secret store</w:t>
             </w:r>
           </w:p>
         </w:tc>
@@ -279,7 +279,7 @@
                 <w:sz w:val="21"/>
                 <w:szCs w:val="21"/>
               </w:rPr>
-              <w:t xml:space="preserve">Password</w:t>
+              <w:t xml:space="preserve">Security</w:t>
             </w:r>
           </w:p>
         </w:tc>
@@ -302,56 +302,7 @@
                 <w:sz w:val="21"/>
                 <w:szCs w:val="21"/>
               </w:rPr>
-              <w:t xml:space="preserve">David2026!</w:t>
-            </w:r>
-          </w:p>
-        </w:tc>
-      </w:tr>
-      <w:tr>
-        <w:tc>
-          <w:tcPr>
-            <w:shd w:fill="EFF3F8" w:val="clear"/>
-            <w:tcMar>
-              <w:top w:type="dxa" w:w="80"/>
-              <w:left w:type="dxa" w:w="120"/>
-              <w:bottom w:type="dxa" w:w="80"/>
-              <w:right w:type="dxa" w:w="120"/>
-            </w:tcMar>
-          </w:tcPr>
-          <w:p>
-            <w:r>
-              <w:rPr>
-                <w:rFonts w:ascii="Calibri" w:cs="Calibri" w:eastAsia="Calibri" w:hAnsi="Calibri"/>
-                <w:b/>
-                <w:bCs/>
-                <w:color w:val="0A2540"/>
-                <w:sz w:val="21"/>
-                <w:szCs w:val="21"/>
-              </w:rPr>
-              <w:t xml:space="preserve">Secure access key</w:t>
-            </w:r>
-          </w:p>
-        </w:tc>
-        <w:tc>
-          <w:tcPr>
-            <w:tcMar>
-              <w:top w:type="dxa" w:w="80"/>
-              <w:left w:type="dxa" w:w="120"/>
-              <w:bottom w:type="dxa" w:w="80"/>
-              <w:right w:type="dxa" w:w="120"/>
-            </w:tcMar>
-          </w:tcPr>
-          <w:p>
-            <w:r>
-              <w:rPr>
-                <w:rFonts w:ascii="Calibri" w:cs="Calibri" w:eastAsia="Calibri" w:hAnsi="Calibri"/>
-                <w:b/>
-                <w:bCs/>
-                <w:color w:val="28251D"/>
-                <w:sz w:val="21"/>
-                <w:szCs w:val="21"/>
-              </w:rPr>
-              <w:t xml:space="preserve">DAVID-2026-SECURE-DEMO</w:t>
+              <w:t xml:space="preserve">Never share credentials in email, chat, or public documents</w:t>
             </w:r>
           </w:p>
         </w:tc>
@@ -361,7 +312,7 @@
       <w:pPr>
         <w:spacing w:after="120" w:before="120"/>
       </w:pPr>
-      <w:hyperlink w:history="1" r:id="rIduxxvkqy2xzfuxeduhypsy">
+      <w:hyperlink w:history="1" r:id="rIdsbzl-ayavqcqlre9wpori">
         <w:r>
           <w:rPr>
             <w:rFonts w:ascii="Calibri" w:cs="Calibri" w:eastAsia="Calibri" w:hAnsi="Calibri"/>

</xml_diff>